<commit_message>
Separate Medicine manuscript table for submission
</commit_message>
<xml_diff>
--- a/Medicine_submission/01_Medicine_Clinical_Case_Report.docx
+++ b/Medicine_submission/01_Medicine_Clinical_Case_Report.docx
@@ -321,186 +321,10 @@
       </w:r>
     </w:p>
     <w:p>
-      <w:pPr>
-        <w:pStyle w:val="Caption"/>
-      </w:pPr>
       <w:r>
-        <w:t>Table 1. Timeline of clinical events.</w:t>
+        <w:t>The clinical course is summarized in Table 1.</w:t>
       </w:r>
     </w:p>
-    <w:tbl>
-      <w:tblPr>
-        <w:tblStyle w:val="TableGrid"/>
-        <w:tblW w:type="auto" w:w="0"/>
-        <w:jc w:val="center"/>
-        <w:tblLook w:firstColumn="1" w:firstRow="1" w:lastColumn="0" w:lastRow="0" w:noHBand="0" w:noVBand="1" w:val="04A0"/>
-      </w:tblPr>
-      <w:tblGrid>
-        <w:gridCol w:w="4680"/>
-        <w:gridCol w:w="4680"/>
-      </w:tblGrid>
-      <w:tr>
-        <w:trPr>
-          <w:tblHeader w:val="true"/>
-        </w:trPr>
-        <w:tc>
-          <w:tcPr>
-            <w:tcW w:type="dxa" w:w="4680"/>
-            <w:vAlign w:val="center"/>
-            <w:shd w:fill="D9EAF7"/>
-          </w:tcPr>
-          <w:p>
-            <w:pPr>
-              <w:spacing w:line="276" w:lineRule="auto" w:after="60"/>
-            </w:pPr>
-            <w:r>
-              <w:rPr>
-                <w:b/>
-              </w:rPr>
-              <w:t>Date/period</w:t>
-            </w:r>
-          </w:p>
-        </w:tc>
-        <w:tc>
-          <w:tcPr>
-            <w:tcW w:type="dxa" w:w="4680"/>
-            <w:vAlign w:val="center"/>
-            <w:shd w:fill="D9EAF7"/>
-          </w:tcPr>
-          <w:p>
-            <w:pPr>
-              <w:spacing w:line="276" w:lineRule="auto" w:after="60"/>
-            </w:pPr>
-            <w:r>
-              <w:rPr>
-                <w:b/>
-              </w:rPr>
-              <w:t>Clinical event</w:t>
-            </w:r>
-          </w:p>
-        </w:tc>
-      </w:tr>
-      <w:tr>
-        <w:tc>
-          <w:tcPr>
-            <w:tcW w:type="dxa" w:w="4680"/>
-            <w:vAlign w:val="center"/>
-          </w:tcPr>
-          <w:p>
-            <w:pPr>
-              <w:spacing w:line="276" w:lineRule="auto" w:after="60"/>
-            </w:pPr>
-            <w:r>
-              <w:t>June 25–27, 2026</w:t>
-            </w:r>
-          </w:p>
-        </w:tc>
-        <w:tc>
-          <w:tcPr>
-            <w:tcW w:type="dxa" w:w="4680"/>
-            <w:vAlign w:val="center"/>
-          </w:tcPr>
-          <w:p>
-            <w:pPr>
-              <w:spacing w:line="276" w:lineRule="auto" w:after="60"/>
-            </w:pPr>
-            <w:r>
-              <w:t>Outside evaluation for abdominal pain showed left ureteral stone and incidental right renal/retroperitoneal masses. Hospital contrast CT identified an enhancing renal nodule and a large low-attenuation septated mass, provisionally interpreted as cystic. Further preoperative biopsy was declined after discussion; partial nephrectomy was planned.</w:t>
-            </w:r>
-          </w:p>
-        </w:tc>
-      </w:tr>
-      <w:tr>
-        <w:tc>
-          <w:tcPr>
-            <w:tcW w:type="dxa" w:w="4680"/>
-            <w:vAlign w:val="center"/>
-          </w:tcPr>
-          <w:p>
-            <w:pPr>
-              <w:spacing w:line="276" w:lineRule="auto" w:after="60"/>
-            </w:pPr>
-            <w:r>
-              <w:t>July 1, 2026</w:t>
-            </w:r>
-          </w:p>
-        </w:tc>
-        <w:tc>
-          <w:tcPr>
-            <w:tcW w:type="dxa" w:w="4680"/>
-            <w:vAlign w:val="center"/>
-          </w:tcPr>
-          <w:p>
-            <w:pPr>
-              <w:spacing w:line="276" w:lineRule="auto" w:after="60"/>
-            </w:pPr>
-            <w:r>
-              <w:t>Laparoscopic exploration revealed a large densely adherent mass. Attempted fine-needle aspiration yielded no fluid; concern for a solid lesion prompted revision to radical nephrectomy and retroperitoneal tumor resection. Left ureteroscopic lithotripsy and stenting were performed concurrently.</w:t>
-            </w:r>
-          </w:p>
-        </w:tc>
-      </w:tr>
-      <w:tr>
-        <w:tc>
-          <w:tcPr>
-            <w:tcW w:type="dxa" w:w="4680"/>
-            <w:vAlign w:val="center"/>
-          </w:tcPr>
-          <w:p>
-            <w:pPr>
-              <w:spacing w:line="276" w:lineRule="auto" w:after="60"/>
-            </w:pPr>
-            <w:r>
-              <w:t>July–September 2026</w:t>
-            </w:r>
-          </w:p>
-        </w:tc>
-        <w:tc>
-          <w:tcPr>
-            <w:tcW w:type="dxa" w:w="4680"/>
-            <w:vAlign w:val="center"/>
-          </w:tcPr>
-          <w:p>
-            <w:pPr>
-              <w:spacing w:line="276" w:lineRule="auto" w:after="60"/>
-            </w:pPr>
-            <w:r>
-              <w:t>Supplementary reports diagnosed DDLPS with focal cartilaginous differentiation and superficial renal involvement; MDM2 FISH ratio 11.77. Later report assigned histological grade III; grading system unspecified.</w:t>
-            </w:r>
-          </w:p>
-        </w:tc>
-      </w:tr>
-      <w:tr>
-        <w:tc>
-          <w:tcPr>
-            <w:tcW w:type="dxa" w:w="4680"/>
-            <w:vAlign w:val="center"/>
-          </w:tcPr>
-          <w:p>
-            <w:pPr>
-              <w:spacing w:line="276" w:lineRule="auto" w:after="60"/>
-            </w:pPr>
-            <w:r>
-              <w:t>3 months after surgery</w:t>
-            </w:r>
-          </w:p>
-        </w:tc>
-        <w:tc>
-          <w:tcPr>
-            <w:tcW w:type="dxa" w:w="4680"/>
-            <w:vAlign w:val="center"/>
-          </w:tcPr>
-          <w:p>
-            <w:pPr>
-              <w:spacing w:line="276" w:lineRule="auto" w:after="60"/>
-            </w:pPr>
-            <w:r>
-              <w:t>Adjuvant chemotherapy was administered. Abdominal CT showed no evidence of recurrence. Long-term outcome remains undetermined.</w:t>
-            </w:r>
-          </w:p>
-        </w:tc>
-      </w:tr>
-    </w:tbl>
     <w:p>
       <w:pPr>
         <w:pStyle w:val="Heading1"/>

</xml_diff>